<commit_message>
Final upload with all love and respect
</commit_message>
<xml_diff>
--- a/Test_Datasets/Questions.docx
+++ b/Test_Datasets/Questions.docx
@@ -6,8 +6,24 @@
       <w:pPr>
         <w:pStyle w:val="ListParagraph"/>
       </w:pPr>
-      <w:r>
-        <w:t>Compare the regions profit</w:t>
+      <w:proofErr w:type="gramStart"/>
+      <w:r>
+        <w:t>Compare</w:t>
+      </w:r>
+      <w:proofErr w:type="gramEnd"/>
+      <w:r>
+        <w:t xml:space="preserve"> the </w:t>
+      </w:r>
+      <w:proofErr w:type="gramStart"/>
+      <w:r>
+        <w:t>regions</w:t>
+      </w:r>
+      <w:proofErr w:type="gramEnd"/>
+      <w:r>
+        <w:t xml:space="preserve"> </w:t>
+      </w:r>
+      <w:r>
+        <w:t>sales</w:t>
       </w:r>
     </w:p>
     <w:p>
@@ -15,7 +31,7 @@
         <w:pStyle w:val="ListParagraph"/>
       </w:pPr>
       <w:r>
-        <w:t>What’s the relation between segment and sales</w:t>
+        <w:t>What is the most profitable segment of orders</w:t>
       </w:r>
     </w:p>
     <w:p>
@@ -23,41 +39,65 @@
         <w:pStyle w:val="ListParagraph"/>
       </w:pPr>
       <w:r>
-        <w:t xml:space="preserve">Compare the category to </w:t>
-      </w:r>
-      <w:r>
-        <w:t>quantity</w:t>
+        <w:t xml:space="preserve">What’s the relationship between </w:t>
+      </w:r>
+      <w:proofErr w:type="gramStart"/>
+      <w:r>
+        <w:t xml:space="preserve">the </w:t>
+      </w:r>
+      <w:r>
+        <w:t>sales</w:t>
+      </w:r>
+      <w:proofErr w:type="gramEnd"/>
+      <w:r>
+        <w:t xml:space="preserve"> and</w:t>
+      </w:r>
+      <w:r>
+        <w:t xml:space="preserve"> </w:t>
+      </w:r>
+      <w:r>
+        <w:t>profit</w:t>
+      </w:r>
+      <w:r>
+        <w:rPr>
+          <w:rFonts w:hint="cs"/>
+          <w:rtl/>
+        </w:rPr>
+        <w:t xml:space="preserve"> </w:t>
       </w:r>
     </w:p>
     <w:p>
       <w:pPr>
         <w:pStyle w:val="ListParagraph"/>
+        <w:rPr>
+          <w:lang w:bidi="ar-EG"/>
+        </w:rPr>
       </w:pPr>
       <w:r>
-        <w:t xml:space="preserve">Show the distribution </w:t>
+        <w:t xml:space="preserve">Show the trend of sales across the ship date </w:t>
+      </w:r>
+      <w:r>
+        <w:t>month</w:t>
+      </w:r>
+      <w:r>
+        <w:t>s</w:t>
       </w:r>
     </w:p>
     <w:p>
       <w:pPr>
         <w:pStyle w:val="ListParagraph"/>
+        <w:rPr>
+          <w:lang w:bidi="ar-EG"/>
+        </w:rPr>
       </w:pPr>
       <w:r>
-        <w:t xml:space="preserve">Show the trend of sales across the </w:t>
-      </w:r>
-      <w:r>
-        <w:t>ship</w:t>
-      </w:r>
-      <w:r>
-        <w:t xml:space="preserve"> </w:t>
-      </w:r>
-      <w:r>
-        <w:t>date</w:t>
-      </w:r>
-      <w:r>
-        <w:t xml:space="preserve"> </w:t>
-      </w:r>
-      <w:r>
-        <w:t>month</w:t>
+        <w:t xml:space="preserve">Show the distribution </w:t>
+      </w:r>
+      <w:r>
+        <w:t xml:space="preserve">of </w:t>
+      </w:r>
+      <w:r>
+        <w:t>order dates</w:t>
       </w:r>
     </w:p>
     <w:sectPr>

</xml_diff>